<commit_message>
Add modern classical baselines and update benchmark results
- Introduced `resnet18_cifar_gray` model for 32x32 grayscale inputs with a CIFAR-style stem.
- Added training script `train_modern_baselines.py` for modern classical baselines.
- Created `modern_baselines.py` to define and register modern classical models.
- Updated benchmark results in the paper draft to include `resnet18_cifar_gray` with test accuracy of `88.13 ± 0.82%`.
- Added new experiment JSON files for seeds 43 and 44 with detailed training metrics.
- Updated draft document to reflect the new benchmark findings and clarify contributions.
</commit_message>
<xml_diff>
--- a/AGENTS.docx
+++ b/AGENTS.docx
@@ -1131,6 +1131,39 @@
         </w:numPr>
       </w:pPr>
       <w:r>
+        <w:t xml:space="preserve">Modern stronger baselines:</w:t>
+      </w:r>
+      <w:r>
+        <w:t xml:space="preserve"> </w:t>
+      </w:r>
+      <w:r>
+        <w:rPr>
+          <w:rStyle w:val="VerbatimChar"/>
+        </w:rPr>
+        <w:t xml:space="preserve">train_modern_baselines.py</w:t>
+      </w:r>
+      <w:r>
+        <w:t xml:space="preserve">,</w:t>
+      </w:r>
+      <w:r>
+        <w:t xml:space="preserve"> </w:t>
+      </w:r>
+      <w:r>
+        <w:rPr>
+          <w:rStyle w:val="VerbatimChar"/>
+        </w:rPr>
+        <w:t xml:space="preserve">src/modern_baselines.py</w:t>
+      </w:r>
+    </w:p>
+    <w:p>
+      <w:pPr>
+        <w:pStyle w:val="Compact"/>
+        <w:numPr>
+          <w:ilvl w:val="0"/>
+          <w:numId w:val="1008"/>
+        </w:numPr>
+      </w:pPr>
+      <w:r>
         <w:t xml:space="preserve">Data:</w:t>
       </w:r>
       <w:r>
@@ -2010,6 +2043,27 @@
           <w:rStyle w:val="VerbatimChar"/>
         </w:rPr>
         <w:t xml:space="preserve">python train_thesis_models.py --help</w:t>
+      </w:r>
+    </w:p>
+    <w:p>
+      <w:pPr>
+        <w:pStyle w:val="Compact"/>
+        <w:numPr>
+          <w:ilvl w:val="0"/>
+          <w:numId w:val="1011"/>
+        </w:numPr>
+      </w:pPr>
+      <w:r>
+        <w:t xml:space="preserve">Modern classical baselines:</w:t>
+      </w:r>
+      <w:r>
+        <w:t xml:space="preserve"> </w:t>
+      </w:r>
+      <w:r>
+        <w:rPr>
+          <w:rStyle w:val="VerbatimChar"/>
+        </w:rPr>
+        <w:t xml:space="preserve">python train_modern_baselines.py --help</w:t>
       </w:r>
     </w:p>
     <w:p>

</xml_diff>